<commit_message>
Record the files WPS wrote during the Windows regression smoke run.
Co-authored-by: Cursor <cursoragent@cursor.com>
</commit_message>
<xml_diff>
--- a/fixtures/phase3/writer_table_regression_smoke.docx
+++ b/fixtures/phase3/writer_table_regression_smoke.docx
@@ -28,14 +28,6 @@
         <w:gridCol w:w="2880"/>
       </w:tblGrid>
       <w:tr>
-        <w:tblPrEx>
-          <w:tblCellMar>
-            <w:top w:w="0" w:type="dxa"/>
-            <w:left w:w="108" w:type="dxa"/>
-            <w:bottom w:w="0" w:type="dxa"/>
-            <w:right w:w="108" w:type="dxa"/>
-          </w:tblCellMar>
-        </w:tblPrEx>
         <w:tc>
           <w:tcPr>
             <w:tcW w:w="2880" w:type="dxa"/>
@@ -436,10 +428,10 @@
     <w:lsdException w:uiPriority="99" w:name="endnote reference"/>
     <w:lsdException w:uiPriority="99" w:name="endnote text"/>
     <w:lsdException w:uiPriority="99" w:name="table of authorities"/>
-    <w:lsdException w:qFormat="1" w:uiPriority="99" w:semiHidden="0" w:name="macro"/>
+    <w:lsdException w:uiPriority="99" w:semiHidden="0" w:name="macro"/>
     <w:lsdException w:uiPriority="99" w:name="toa heading"/>
     <w:lsdException w:uiPriority="99" w:semiHidden="0" w:name="List"/>
-    <w:lsdException w:uiPriority="99" w:semiHidden="0" w:name="List Bullet"/>
+    <w:lsdException w:qFormat="1" w:uiPriority="99" w:semiHidden="0" w:name="List Bullet"/>
     <w:lsdException w:uiPriority="99" w:semiHidden="0" w:name="List Number"/>
     <w:lsdException w:uiPriority="99" w:semiHidden="0" w:name="List 2"/>
     <w:lsdException w:uiPriority="99" w:semiHidden="0" w:name="List 3"/>
@@ -918,7 +910,6 @@
     <w:name w:val="macro"/>
     <w:link w:val="147"/>
     <w:unhideWhenUsed/>
-    <w:qFormat/>
     <w:uiPriority w:val="99"/>
     <w:pPr>
       <w:tabs>
@@ -1003,6 +994,7 @@
     <w:name w:val="List Bullet"/>
     <w:basedOn w:val="1"/>
     <w:unhideWhenUsed/>
+    <w:qFormat/>
     <w:uiPriority w:val="99"/>
     <w:pPr>
       <w:numPr>

</xml_diff>